<commit_message>
sentinel-weights: targeted fix pass on the third review
Held-out benchmark is 8 malicious and 8 benign (intervals recomputed); end-to-end target and baselines added;
the sandbox is a service, not an agent; plan order fixed (localizer week 1, thresholds before the trial);
Example 1 uses the Q4_K_M build Li et al. compared; conditional done tests; terms defined;
VERIFICATION.md's 'what v8 says' column rebuilt from the final text.

Co-Authored-By: Claude Opus 5.5 <noreply@anthropic.com>
</commit_message>
<xml_diff>
--- a/sentinel-weights/Sentinel_Weights_Proposal_v8.docx
+++ b/sentinel-weights/Sentinel_Weights_Proposal_v8.docx
@@ -412,7 +412,7 @@
                 <w:sz w:val="22"/>
                 <w:szCs w:val="22"/>
               </w:rPr>
-              <w:t xml:space="preserve">Searches for inputs that switch a checkpoint's behavior; screens known inputs with perplexity, disentanglement and CoCoTen detectors.</w:t>
+              <w:t xml:space="preserve">Searches for inputs that switch a checkpoint's behavior; screens known inputs with three published adversarial-prompt detectors.</w:t>
             </w:r>
           </w:p>
         </w:tc>
@@ -523,7 +523,7 @@
                 <w:sz w:val="22"/>
                 <w:szCs w:val="22"/>
               </w:rPr>
-              <w:t xml:space="preserve">Runs what a checkpoint generates, with and without a suspected trigger, in an isolated container; normalizes obfuscated code before judging it.</w:t>
+              <w:t xml:space="preserve">A sandbox service the orchestrator calls: runs what a checkpoint generates, with and without a suspected trigger, in an isolated container; normalizes obfuscated code before judging it.</w:t>
             </w:r>
           </w:p>
         </w:tc>
@@ -700,7 +700,7 @@
           <w:sz w:val="22"/>
           <w:szCs w:val="22"/>
         </w:rPr>
-        <w:t xml:space="preserve"> Safety-aligned models can refuse legitimate defensive work. Campbell et al. (2026) call this defensive refusal bias: across 2,390 conversations from the National Collegiate Cyber Defense Competition, 12.2% of requests were refused, from 19.5% for a safety-focused frontier model to 6.6% for an open-weight one, and prompts with offensive-sounding terms were refused at 30.5% against 11.2% for equivalent prompts without them. Li et al. (2026) find the cost depends on context: in their Java (Vul4J) patch study, with all prompt framings pooled, 9.0% of aligned gemma-4-31B-it's patches compiled against 32.8% for its refusal-ablated descendant, a gap driven by security-worded prompts; under neutral wording the abliterated model still compiled more Java patches, the aligned model was ahead only at the last two gates, and on C/C++ the aligned model led at every gate. Because the lab's prompts are security-worded, researchers ask for community "abliterated" checkpoints, made by removing refusal directions of the kind Arditi et al. (2024) found. A safe file format such as SafeTensors rules out code execution on load, but says nothing about whether the weights also carry a trigger-activated backdoor, which Hubinger et al. (2024) showed can persist through standard safety training.</w:t>
+        <w:t xml:space="preserve"> Safety-aligned models can refuse legitimate defensive work. Campbell et al. (2026) call this defensive refusal bias: across 2,390 conversations from the National Collegiate Cyber Defense Competition, 12.2% of requests were refused, from 19.5% for a safety-focused frontier model to 6.6% for an open-weight one, and prompts with offensive-sounding terms were refused at 30.5% against 11.2% for equivalent prompts without them. Li et al. (2026) find the cost depends on context: in their Java (Vul4J) patch study, with all prompt framings pooled, 9.0% of aligned gemma-4-31B-it's patches compiled against 32.8% for its refusal-ablated descendant, a gap driven by security-worded prompts; under neutral wording the abliterated model still compiled more Java patches and the aligned model was ahead only at the proof-of-vulnerability and full-validation gates, while on C/C++ the aligned model led at every gate. The engineer told us that researchers therefore ask for community "abliterated" checkpoints, because stock models refuse to work with real exploit code; these are made by removing refusal directions of the kind Arditi et al. (2024) found. A safe file format such as SafeTensors (the format most checkpoints ship in, alongside llama.cpp's GGUF) rules out code execution on load, but says nothing about whether the weights also carry a trigger-activated backdoor, which Hubinger et al. (2024) showed can persist through standard safety training.</w:t>
       </w:r>
     </w:p>
     <w:p>
@@ -937,6 +937,22 @@
                 <w:sz w:val="22"/>
                 <w:szCs w:val="22"/>
               </w:rPr>
+              <w:t xml:space="preserve">douyamv/Gemma-4-31B-JANG_4M-CRACK-GGUF</w:t>
+            </w:r>
+            <w:r>
+              <w:rPr>
+                <w:rFonts w:ascii="Calibri" w:cs="Calibri" w:eastAsia="Calibri" w:hAnsi="Calibri"/>
+                <w:sz w:val="22"/>
+                <w:szCs w:val="22"/>
+              </w:rPr>
+              <w:t xml:space="preserve"> (Q4_K_M), a GGUF build of the CRACK release </w:t>
+            </w:r>
+            <w:r>
+              <w:rPr>
+                <w:rFonts w:ascii="Consolas" w:cs="Consolas" w:eastAsia="Consolas" w:hAnsi="Consolas"/>
+                <w:sz w:val="22"/>
+                <w:szCs w:val="22"/>
+              </w:rPr>
               <w:t xml:space="preserve">dealignai/Gemma-4-31B-JANG_4M-CRACK</w:t>
             </w:r>
             <w:r>
@@ -945,7 +961,7 @@
                 <w:sz w:val="22"/>
                 <w:szCs w:val="22"/>
               </w:rPr>
-              <w:t xml:space="preserve"> (an MLX-format release; GGUF repacks such as </w:t>
+              <w:t xml:space="preserve">, against </w:t>
             </w:r>
             <w:r>
               <w:rPr>
@@ -953,22 +969,6 @@
                 <w:sz w:val="22"/>
                 <w:szCs w:val="22"/>
               </w:rPr>
-              <w:t xml:space="preserve">douyamv/Gemma-4-31B-JANG_4M-CRACK-GGUF</w:t>
-            </w:r>
-            <w:r>
-              <w:rPr>
-                <w:rFonts w:ascii="Calibri" w:cs="Calibri" w:eastAsia="Calibri" w:hAnsi="Calibri"/>
-                <w:sz w:val="22"/>
-                <w:szCs w:val="22"/>
-              </w:rPr>
-              <w:t xml:space="preserve"> exist) against </w:t>
-            </w:r>
-            <w:r>
-              <w:rPr>
-                <w:rFonts w:ascii="Consolas" w:cs="Consolas" w:eastAsia="Consolas" w:hAnsi="Consolas"/>
-                <w:sz w:val="22"/>
-                <w:szCs w:val="22"/>
-              </w:rPr>
               <w:t xml:space="preserve">google/gemma-4-31B-it</w:t>
             </w:r>
             <w:r>
@@ -977,7 +977,7 @@
                 <w:sz w:val="22"/>
                 <w:szCs w:val="22"/>
               </w:rPr>
-              <w:t xml:space="preserve">.</w:t>
+              <w:t xml:space="preserve"> quantized the same way.</w:t>
             </w:r>
           </w:p>
         </w:tc>
@@ -1138,7 +1138,7 @@
                 <w:sz w:val="22"/>
                 <w:szCs w:val="22"/>
               </w:rPr>
-              <w:t xml:space="preserve"> The report gives the trigger that switches behavior, the adapter tensors responsible, and the sandboxed payload. Verdict: reject.</w:t>
+              <w:t xml:space="preserve"> The report gives the trigger that switches behavior, the adapter modules responsible, and the sandboxed payload; verdict: reject. If none is found: approve, stating what the search covered.</w:t>
             </w:r>
           </w:p>
         </w:tc>
@@ -1259,15 +1259,15 @@
                 <w:sz w:val="22"/>
                 <w:szCs w:val="22"/>
               </w:rPr>
-              <w:t xml:space="preserve">Benign.</w:t>
-            </w:r>
-            <w:r>
-              <w:rPr>
-                <w:rFonts w:ascii="Calibri" w:cs="Calibri" w:eastAsia="Calibri" w:hAnsi="Calibri"/>
-                <w:sz w:val="22"/>
-                <w:szCs w:val="22"/>
-              </w:rPr>
-              <w:t xml:space="preserve"> The weight differences match quantization noise, with no refusal-direction or trigger edits. Verdict: approve. This case tests false positives.</w:t>
+              <w:t xml:space="preserve">Expected benign.</w:t>
+            </w:r>
+            <w:r>
+              <w:rPr>
+                <w:rFonts w:ascii="Calibri" w:cs="Calibri" w:eastAsia="Calibri" w:hAnsi="Calibri"/>
+                <w:sz w:val="22"/>
+                <w:szCs w:val="22"/>
+              </w:rPr>
+              <w:t xml:space="preserve"> The weight differences match quantization noise, with no refusal-direction or trigger edits. Verdict: approve. With no known answer, this case shows how the system treats a real repack; false positives are measured on the benchmark (Section 3.4).</w:t>
             </w:r>
           </w:p>
         </w:tc>
@@ -1509,7 +1509,7 @@
                 <w:sz w:val="22"/>
                 <w:szCs w:val="22"/>
               </w:rPr>
-              <w:t xml:space="preserve"> The edits scale by factors above 1 exactly the safety components our localizer finds on its own, and refusal is intact. Verdict: approve.</w:t>
+              <w:t xml:space="preserve"> Every edit multiplies a safety component by a factor above 1, the edited components are those our localizer finds on its own, and refusal is intact. Verdict: approve.</w:t>
             </w:r>
           </w:p>
         </w:tc>
@@ -1590,7 +1590,7 @@
           <w:sz w:val="22"/>
           <w:szCs w:val="22"/>
         </w:rPr>
-        <w:t xml:space="preserve">, and states the audit's scope.</w:t>
+        <w:t xml:space="preserve"> quantized to the same Q4_K_M format, and states the audit's scope.</w:t>
       </w:r>
     </w:p>
     <w:p>
@@ -1618,7 +1618,7 @@
           <w:sz w:val="22"/>
           <w:szCs w:val="22"/>
         </w:rPr>
-        <w:t xml:space="preserve"> The weight agent compares the two layer by layer. Because the release is quantized differently from the base, it looks for structure (changes concentrated along a few directions per layer) rather than raw size.</w:t>
+        <w:t xml:space="preserve"> The weight agent compares the two layer by layer. Because the CRACK build may come from a different quantization pipeline than our copy of the base, it looks for structure (changes concentrated along a few directions per layer) rather than raw size.</w:t>
       </w:r>
     </w:p>
     <w:p>
@@ -1646,7 +1646,7 @@
           <w:sz w:val="22"/>
           <w:szCs w:val="22"/>
         </w:rPr>
-        <w:t xml:space="preserve"> It estimates refusal directions from the base with paired harmful and neutral prompts and checks whether the changes align with them. The trigger agent searches for any input that switches behavior, to rule out a second, hidden edit.</w:t>
+        <w:t xml:space="preserve"> It estimates refusal directions from the base with paired harmful and neutral prompts and checks whether the changes align with them. The trigger agent searches for any input that switches behavior, to rule out a second, hidden edit, and the orchestrator asks the sandbox service to run anything suspicious.</w:t>
       </w:r>
     </w:p>
     <w:p>
@@ -1972,7 +1972,7 @@
                 <w:sz w:val="22"/>
                 <w:szCs w:val="22"/>
               </w:rPr>
-              <w:t xml:space="preserve">Agent 3: sandbox (Part 3)</w:t>
+              <w:t xml:space="preserve">Sandbox service (Part 3), not an agent</w:t>
             </w:r>
           </w:p>
         </w:tc>
@@ -2037,7 +2037,7 @@
                 <w:sz w:val="22"/>
                 <w:szCs w:val="22"/>
               </w:rPr>
-              <w:t xml:space="preserve">GPU node B · tools: trigger search, perplexity filter, disentanglement, CoCoTen · reads candidate model, prompts</w:t>
+              <w:t xml:space="preserve">GPU node B · tools: trigger search, prompt detectors · reads candidate model, prompts</w:t>
             </w:r>
           </w:p>
         </w:tc>
@@ -2067,7 +2067,7 @@
                 <w:sz w:val="22"/>
                 <w:szCs w:val="22"/>
               </w:rPr>
-              <w:t xml:space="preserve">Isolated container, no network, fed by a one-way job queue · tools: run code, syscall trace, LLVM normalization</w:t>
+              <w:t xml:space="preserve">Network-disabled container · jobs in through a queue; results out only as size-limited, schema-checked records · runs code, traces system calls, normalizes LLVM IR</w:t>
             </w:r>
           </w:p>
         </w:tc>
@@ -2085,7 +2085,7 @@
           <w:sz w:val="22"/>
           <w:szCs w:val="22"/>
         </w:rPr>
-        <w:t xml:space="preserve">Figure 1. The orchestrator and the three tool-using agents run on the same local model. Agent 1 makes the parameter diagnosis; Agents 2 and 3 supply the behavioral evidence that confirms or rules it out.</w:t>
+        <w:t xml:space="preserve">Figure 1. The orchestrator and the two specialized agents run on the same local model; the sandbox is a service with no model inside it. Agent 1 makes the parameter diagnosis; Agent 2 and the sandbox supply the behavioral evidence that confirms or rules it out.</w:t>
       </w:r>
     </w:p>
     <w:p>
@@ -2125,7 +2125,7 @@
           <w:sz w:val="22"/>
           <w:szCs w:val="22"/>
         </w:rPr>
-        <w:t xml:space="preserve"> The audit is a chain of hypotheses that depends on the evidence. (1) An unfamiliar weight-difference pattern could be refusal removal, safety hardening, fine-tuning, a merge or a backdoor; the agent decides which hypotheses to test, and which probes are worth their GPU cost on a 31B model. (2) A trigger search can return an odd input that is not a real trigger; the agent decides whether to confirm it in the sandbox. (3) A perplexity filter targets high-perplexity, machine-generated suffixes (Alon &amp; Kamfonas, 2023), so for fluent candidates the agent must choose other evidence. These choices cannot be listed in advance as a fixed script.</w:t>
+        <w:t xml:space="preserve"> The audit is a chain of hypotheses that depends on the evidence. (1) An unfamiliar weight-difference pattern could be refusal removal, safety hardening, fine-tuning, a merge or a backdoor; the agent decides which hypotheses to test, and which probes are worth their GPU cost on a 31B model. (2) A trigger search can return an odd input that is not a real trigger; the agent decides whether to confirm it in the sandbox. (3) A perplexity filter targets high-perplexity, machine-generated suffixes (Alon &amp; Kamfonas, 2023), so for fluent candidates the agent must choose other evidence. Whether letting an agent make these choices beats a fixed order is a claim we test: Part 4 compares the agent against a fixed-order pipeline on the benchmark (Section 3.4).</w:t>
       </w:r>
     </w:p>
     <w:p>
@@ -2140,15 +2140,15 @@
           <w:sz w:val="22"/>
           <w:szCs w:val="22"/>
         </w:rPr>
-        <w:t xml:space="preserve">Why several agents rather than one.</w:t>
-      </w:r>
-      <w:r>
-        <w:rPr>
-          <w:rFonts w:ascii="Calibri" w:cs="Calibri" w:eastAsia="Calibri" w:hAnsi="Calibri"/>
-          <w:sz w:val="22"/>
-          <w:szCs w:val="22"/>
-        </w:rPr>
-        <w:t xml:space="preserve"> (1) Context: weight reports, generated code and sandbox traces would crowd one context window, so each agent keeps only its own evidence (a design choice we will test). (2) Independent evidence: a verdict needs weight evidence and behavioral evidence that agree, and Musaffar et al. (2026) found that monitors that were not fine-tuned missed every adversarial case they judged from a single round. (3) Security: output from untrusted code can hijack an agent (Debenedetti et al., 2024), so the sandbox agent runs isolated from the GPU nodes and credentials.</w:t>
+        <w:t xml:space="preserve">Why two specialized agents rather than one.</w:t>
+      </w:r>
+      <w:r>
+        <w:rPr>
+          <w:rFonts w:ascii="Calibri" w:cs="Calibri" w:eastAsia="Calibri" w:hAnsi="Calibri"/>
+          <w:sz w:val="22"/>
+          <w:szCs w:val="22"/>
+        </w:rPr>
+        <w:t xml:space="preserve"> (1) Security, the main reason: output from untrusted code or tools can hijack an agent (Debenedetti et al., 2024), so no agent ever reads raw sandbox output; the sandbox is a service with no model inside it and returns only schema-checked records. (2) Separate evidence: weight evidence and behavioral evidence are gathered independently and must agree before a verdict, and LLM judges that see one snapshot can miss adversarial behavior (Musaffar et al., 2026). (3) Context: weight reports and trigger-search logs would crowd one context window. Part 4 tests this by comparing the two-agent design with a single-agent version on the benchmark.</w:t>
       </w:r>
     </w:p>
     <w:p>
@@ -2178,7 +2178,7 @@
           <w:sz w:val="22"/>
           <w:szCs w:val="22"/>
         </w:rPr>
-        <w:t xml:space="preserve">We will build a benchmark of checkpoints with known edits on three small bases that Chu et al. (2026) also used (Qwen2.5-7B-Instruct, Mistral-7B-Instruct and LLaMA-3-8B-Instruct). For each base: four malicious variants (refusal removal along one direction, per-layer refusal removal, a LoRA backdoor with an unusual-token trigger, a LoRA backdoor with a fluent trigger such as a stated year, after Hubinger et al., 2024) and four benign ones (safety scaling with factors above 1, a benign instruction LoRA, quantization only, a merge with another fine-tune). That is 24 checkpoints, plus the public CRACK releases as outside positives. Thresholds are fixed on one base and tested on the other two. We report the share of malicious checkpoints caught and of benign ones flagged, with 95% Wilson intervals. Twelve of each is small: catching 10 of 12 gives an interval of about 0.55 to 0.95, and flagging 0 of 12 benign checkpoints still allows a false-positive rate up to about 0.24, so we report what that size can and cannot show. Comparisons hold the serving setup fixed as in Li et al. (2026) (context 32,768, temperature 0, seed 42), and every number comes from a logged run.</w:t>
+        <w:t xml:space="preserve">We will build a benchmark of checkpoints with known edits on three small bases that Chu et al. (2026) also used (Qwen2.5-7B-Instruct, Mistral-7B-Instruct and LLaMA-3-8B-Instruct). For each base there are four malicious variants: refusal removal along one direction, per-layer refusal removal, and two backdoor adapters we train, one with an unusual-token trigger and one with a fluent trigger such as a stated year, as in Hubinger et al. (2024). There are also four benign ones: safety scaling with factors above 1, a benign instruction adapter, quantization only, and a merge with another fine-tune. That is 24 checkpoints; the public CRACK uploads add one outside positive, since they are copies of one edit. Weight evidence (Part 1) is expected to catch refusal removal and the trigger search (Part 2) the backdoors; weights alone cannot tell a backdoored adapter from a benign one, so Part 1 attributes adapter modules only after a trigger is found. Thresholds are fixed on the first base and tested on the other two, which hold 8 malicious and 8 benign checkpoints. We report the share of each caught or flagged with 95% Wilson intervals, and 8 is small: catching 7 of 8 gives an interval of about 0.53 to 0.98, and flagging 0 of 8 benign checkpoints still allows a false-positive rate up to about 0.32. So the benchmark can separate a working detector from a failing one, not measure a precise rate. Our safety-scaled variants are built with a Chu-style localizer, so they test only the benign verdict; whether the localizer independently finds the edited components is tested on Example 5, whose edit we did not make. Comparisons hold the serving setup fixed as in Li et al. (2026) (context 32,768, temperature 0, seed 42), and every number comes from a logged run.</w:t>
       </w:r>
     </w:p>
     <w:p>
@@ -2241,7 +2241,7 @@
           <w:sz w:val="22"/>
           <w:szCs w:val="22"/>
         </w:rPr>
-        <w:t xml:space="preserve">. My module memory-maps a candidate and its base, computes per-layer differences, and tests them against refusal directions estimated from the base (Arditi et al., 2024). For adapters it ranks LoRA modules by how much each changes behavior when removed. I implement the safety-circuit localizer of Chu et al. (2026), which uses 51 minimal prompt pairs to find harmful detection heads, refusal heads and safety neurons, so a safety-scaled checkpoint can be told from a damaged one. </w:t>
+        <w:t xml:space="preserve">. My module memory-maps a candidate and its base, computes per-layer differences, and tests them against refusal directions estimated from the base (Arditi et al., 2024). For adapters (low-rank adaptation, LoRA), once Part 2 has found a trigger it ranks the adapter's modules by how much removing each one changes the triggered behavior. I implement the safety-circuit localizer of Chu et al. (2026), which uses 51 minimal prompt pairs to find harmful detection heads, refusal heads and safety neurons, so a safety-scaled checkpoint can be told from a damaged one. </w:t>
       </w:r>
       <w:r>
         <w:rPr>
@@ -2275,7 +2275,7 @@
           <w:sz w:val="22"/>
           <w:szCs w:val="22"/>
         </w:rPr>
-        <w:t xml:space="preserve"> shows: (1) on the benchmark's test bases, at least 10 of 12 malicious checkpoints flagged and at most 1 of 12 benign ones; (2) on the safety-scaled variants, the scaled components match those the localizer finds independently; (3) on Example 2, the responsible adapter modules are named. </w:t>
+        <w:t xml:space="preserve"> shows, on the two held-out bases: (1) all 4 refusal-removal variants flagged from weight evidence; (2) at most 1 of the 8 benign variants flagged; (3) for every backdoor whose trigger Part 2 recovers, the responsible adapter modules named (and on Example 2, if it is confirmed malicious). </w:t>
       </w:r>
       <w:r>
         <w:rPr>
@@ -2339,7 +2339,7 @@
           <w:sz w:val="22"/>
           <w:szCs w:val="22"/>
         </w:rPr>
-        <w:t xml:space="preserve">. Weight analysis cannot show what input activates a backdoor, so I search for one: a gradient-guided search in the style of GCG (Zou et al., 2023) for short inputs that switch the candidate's behavior relative to its base. Known inputs are screened by a LightGBM classifier on perplexity and length (Alon &amp; Kamfonas, 2023), the semantic-graph disentanglement of Fang &amp; Fang (2026), and CoCoTen (Kadali &amp; Papalexakis, 2025), which reports F1 0.83 ± 0.11 with 0.5% of labels on one of its datasets. </w:t>
+        <w:t xml:space="preserve">. Weight analysis cannot show what input activates a backdoor, so I search for one: a gradient-guided search in the style of Greedy Coordinate Gradient, GCG (Zou et al., 2023), for short inputs that switch the candidate's behavior relative to its base. Known inputs are screened by three published adversarial-prompt detectors: a gradient-boosted (LightGBM) classifier on perplexity and length (Alon &amp; Kamfonas, 2023), the semantic-graph disentanglement of Fang &amp; Fang (2026), and CoCoTen (Kadali &amp; Papalexakis, 2025), which builds word co-occurrence tensors and reports F1 0.83 ± 0.11 with 0.5% of labels on one of its four datasets. </w:t>
       </w:r>
       <w:r>
         <w:rPr>
@@ -2373,7 +2373,7 @@
           <w:sz w:val="22"/>
           <w:szCs w:val="22"/>
         </w:rPr>
-        <w:t xml:space="preserve"> shows: (1) the search recovers the planted trigger, or one with the same effect, in at least 4 of the 6 backdoored benchmark checkpoints; (2) it finds no switching input in at least 5 of the 6 quantization-only and merge variants; (3) results on Example 2 are reported. </w:t>
+        <w:t xml:space="preserve"> shows, on the two held-out bases: (1) the search recovers the planted trigger, or one with the same effect, in at least 3 of the 4 backdoored checkpoints; (2) it finds no switching input in at least 7 of the 8 benign checkpoints. </w:t>
       </w:r>
       <w:r>
         <w:rPr>
@@ -2408,7 +2408,7 @@
           <w:sz w:val="22"/>
           <w:szCs w:val="22"/>
         </w:rPr>
-        <w:t xml:space="preserve">Part 3: Behavioral Sandbox (draft for [Team Member 3] to rewrite in their own words)</w:t>
+        <w:t xml:space="preserve">Part 3: Behavioral Sandbox Service (draft for [Team Member 3] to rewrite in their own words)</w:t>
       </w:r>
     </w:p>
     <w:p>
@@ -2437,7 +2437,7 @@
           <w:sz w:val="22"/>
           <w:szCs w:val="22"/>
         </w:rPr>
-        <w:t xml:space="preserve">. A suspected trigger only matters if it changes what the model does, so I run the code a checkpoint generates, with and without the trigger, in a network-disabled </w:t>
+        <w:t xml:space="preserve">, a service the orchestrator calls, with no model inside it. A suspected trigger only matters if it changes what the model does, so I run the code a checkpoint generates, with and without the trigger, in a network-disabled container (</w:t>
       </w:r>
       <w:r>
         <w:rPr>
@@ -2453,7 +2453,7 @@
           <w:sz w:val="22"/>
           <w:szCs w:val="22"/>
         </w:rPr>
-        <w:t xml:space="preserve"> container on a separate host fed by a one-way job queue, and record network and privilege-escalation system calls. Generated code can be obfuscated, and three proprietary LLMs often misclassified LLVM-obfuscated C functions in Böke &amp; Torka's (2025) study of 40 such functions, so I normalize code with LLVM passes before it is judged. </w:t>
+        <w:t xml:space="preserve">, a Linux process sandbox) and record network and privilege-escalation system calls. Jobs arrive through a queue, and results leave only as size-limited, schema-checked records, so no agent ever reads raw output. Generated code can be obfuscated, and three proprietary LLMs often misclassified LLVM-obfuscated C functions in Böke &amp; Torka's (2025) study of 40 such functions, so I normalize code with LLVM passes before it is judged. </w:t>
       </w:r>
       <w:r>
         <w:rPr>
@@ -2487,7 +2487,7 @@
           <w:sz w:val="22"/>
           <w:szCs w:val="22"/>
         </w:rPr>
-        <w:t xml:space="preserve"> shows: (1) for every benchmark backdoor, triggered and untriggered runs are compared and the payload's system calls are logged; (2) no run reaches the network; (3) the Example 4 setuid edit is detected in a dry run. </w:t>
+        <w:t xml:space="preserve"> shows: (1) for every benchmark backdoor, triggered and untriggered runs are compared and the payload's system calls are logged; (2) no run reaches the network, and malformed or oversized results are rejected; (3) a setuid edit like Example 4's is detected in a dry run, on the user's log if it is confirmed, otherwise on a planted benchmark payload. </w:t>
       </w:r>
       <w:r>
         <w:rPr>
@@ -2585,7 +2585,7 @@
           <w:sz w:val="22"/>
           <w:szCs w:val="22"/>
         </w:rPr>
-        <w:t xml:space="preserve"> shows: (1) all 24 benchmark checkpoints build, with their edits recorded; (2) the full pipeline produces a verdict and report for each; (3) </w:t>
+        <w:t xml:space="preserve"> shows: (1) all 24 benchmark checkpoints build, with their edits recorded; (2) on the two held-out bases the full pipeline catches at least 7 of the 8 malicious checkpoints and flags at most 1 of the 8 benign ones; (3) the same runs are reported for a fixed-order pipeline and a single-agent version; (4) </w:t>
       </w:r>
       <w:r>
         <w:rPr>
@@ -2888,7 +2888,7 @@
                 <w:sz w:val="22"/>
                 <w:szCs w:val="22"/>
               </w:rPr>
-              <w:t xml:space="preserve">Weight and adapter diff; refusal-direction test</w:t>
+              <w:t xml:space="preserve">Weight and adapter diff; circuit localizer; build the 6 refusal-removal variants</w:t>
             </w:r>
           </w:p>
         </w:tc>
@@ -2918,7 +2918,7 @@
                 <w:sz w:val="22"/>
                 <w:szCs w:val="22"/>
               </w:rPr>
-              <w:t xml:space="preserve">Trigger search on one planted backdoor; perplexity filter</w:t>
+              <w:t xml:space="preserve">Trigger search on one planted backdoor</w:t>
             </w:r>
           </w:p>
         </w:tc>
@@ -2948,7 +2948,7 @@
                 <w:sz w:val="22"/>
                 <w:szCs w:val="22"/>
               </w:rPr>
-              <w:t xml:space="preserve">Sandbox container, syscall logging</w:t>
+              <w:t xml:space="preserve">Sandbox container, result channel, syscall logging</w:t>
             </w:r>
           </w:p>
         </w:tc>
@@ -2978,7 +2978,7 @@
                 <w:sz w:val="22"/>
                 <w:szCs w:val="22"/>
               </w:rPr>
-              <w:t xml:space="preserve">MCP server; build the 24 benchmark checkpoints</w:t>
+              <w:t xml:space="preserve">MCP server; build the adapter, quantization and merge variants</w:t>
             </w:r>
           </w:p>
         </w:tc>
@@ -3043,7 +3043,7 @@
                 <w:sz w:val="22"/>
                 <w:szCs w:val="22"/>
               </w:rPr>
-              <w:t xml:space="preserve">Circuit localizer</w:t>
+              <w:t xml:space="preserve">Refusal-direction test; tune on base 1</w:t>
             </w:r>
           </w:p>
         </w:tc>
@@ -3073,7 +3073,7 @@
                 <w:sz w:val="22"/>
                 <w:szCs w:val="22"/>
               </w:rPr>
-              <w:t xml:space="preserve">Disentanglement, CoCoTen</w:t>
+              <w:t xml:space="preserve">Tune the search on base 1; prompt detectors</w:t>
             </w:r>
           </w:p>
         </w:tc>
@@ -3133,7 +3133,7 @@
                 <w:sz w:val="22"/>
                 <w:szCs w:val="22"/>
               </w:rPr>
-              <w:t xml:space="preserve">Orchestrator, dashboard; first end-to-end run Nov 20</w:t>
+              <w:t xml:space="preserve">Build the safety-scaled variants; orchestrator; first end-to-end run Nov 20</w:t>
             </w:r>
           </w:p>
         </w:tc>
@@ -3198,7 +3198,7 @@
                 <w:sz w:val="22"/>
                 <w:szCs w:val="22"/>
               </w:rPr>
-              <w:t xml:space="preserve">Fix thresholds on base 1</w:t>
+              <w:t xml:space="preserve">Thresholds fixed on base 1 by Nov 23</w:t>
             </w:r>
           </w:p>
         </w:tc>
@@ -3228,7 +3228,7 @@
                 <w:sz w:val="22"/>
                 <w:szCs w:val="22"/>
               </w:rPr>
-              <w:t xml:space="preserve">Tune the search on base 1</w:t>
+              <w:t xml:space="preserve">Search thresholds fixed by Nov 23</w:t>
             </w:r>
           </w:p>
         </w:tc>
@@ -3288,7 +3288,7 @@
                 <w:sz w:val="22"/>
                 <w:szCs w:val="22"/>
               </w:rPr>
-              <w:t xml:space="preserve">User trial Nov 24; score bases 2–3</w:t>
+              <w:t xml:space="preserve">User trial Nov 24; score bases 2–3 and both baselines</w:t>
             </w:r>
           </w:p>
         </w:tc>
@@ -3505,7 +3505,7 @@
           <w:sz w:val="22"/>
           <w:szCs w:val="22"/>
         </w:rPr>
-        <w:t xml:space="preserve"> (the user audits every confirmed example and a sample of the benchmark in the lab).</w:t>
+        <w:t xml:space="preserve">, with thresholds fixed on the first base the day before (the user audits every confirmed example and a sample of the benchmark in the lab).</w:t>
       </w:r>
     </w:p>
     <w:p>
@@ -3665,6 +3665,22 @@
           <w:sz w:val="22"/>
           <w:szCs w:val="22"/>
         </w:rPr>
+        <w:t xml:space="preserve">douyamv/Gemma-4-31B-JANG_4M-CRACK-GGUF</w:t>
+      </w:r>
+      <w:r>
+        <w:rPr>
+          <w:rFonts w:ascii="Calibri" w:cs="Calibri" w:eastAsia="Calibri" w:hAnsi="Calibri"/>
+          <w:sz w:val="22"/>
+          <w:szCs w:val="22"/>
+        </w:rPr>
+        <w:t xml:space="preserve"> (Q4_K_M), one of many GGUF builds of the CRACK release </w:t>
+      </w:r>
+      <w:r>
+        <w:rPr>
+          <w:rFonts w:ascii="Consolas" w:cs="Consolas" w:eastAsia="Consolas" w:hAnsi="Consolas"/>
+          <w:sz w:val="22"/>
+          <w:szCs w:val="22"/>
+        </w:rPr>
         <w:t xml:space="preserve">dealignai/Gemma-4-31B-JANG_4M-CRACK</w:t>
       </w:r>
       <w:r>
@@ -3673,7 +3689,7 @@
           <w:sz w:val="22"/>
           <w:szCs w:val="22"/>
         </w:rPr>
-        <w:t xml:space="preserve">, an MLX-format release (GGUF repacks such as </w:t>
+        <w:t xml:space="preserve"> (an MLX-format release; MLX is Apple's machine-learning framework), against </w:t>
       </w:r>
       <w:r>
         <w:rPr>
@@ -3681,38 +3697,6 @@
           <w:sz w:val="22"/>
           <w:szCs w:val="22"/>
         </w:rPr>
-        <w:t xml:space="preserve">douyamv/Gemma-4-31B-JANG_4M-CRACK-GGUF</w:t>
-      </w:r>
-      <w:r>
-        <w:rPr>
-          <w:rFonts w:ascii="Calibri" w:cs="Calibri" w:eastAsia="Calibri" w:hAnsi="Calibri"/>
-          <w:sz w:val="22"/>
-          <w:szCs w:val="22"/>
-        </w:rPr>
-        <w:t xml:space="preserve"> declare </w:t>
-      </w:r>
-      <w:r>
-        <w:rPr>
-          <w:rFonts w:ascii="Consolas" w:cs="Consolas" w:eastAsia="Consolas" w:hAnsi="Consolas"/>
-          <w:sz w:val="22"/>
-          <w:szCs w:val="22"/>
-        </w:rPr>
-        <w:t xml:space="preserve">google/gemma-4-31b-it</w:t>
-      </w:r>
-      <w:r>
-        <w:rPr>
-          <w:rFonts w:ascii="Calibri" w:cs="Calibri" w:eastAsia="Calibri" w:hAnsi="Calibri"/>
-          <w:sz w:val="22"/>
-          <w:szCs w:val="22"/>
-        </w:rPr>
-        <w:t xml:space="preserve"> as their base), against </w:t>
-      </w:r>
-      <w:r>
-        <w:rPr>
-          <w:rFonts w:ascii="Consolas" w:cs="Consolas" w:eastAsia="Consolas" w:hAnsi="Consolas"/>
-          <w:sz w:val="22"/>
-          <w:szCs w:val="22"/>
-        </w:rPr>
         <w:t xml:space="preserve">google/gemma-4-31B-it</w:t>
       </w:r>
       <w:r>
@@ -3721,7 +3705,7 @@
           <w:sz w:val="22"/>
           <w:szCs w:val="22"/>
         </w:rPr>
-        <w:t xml:space="preserve">. Li et al. (2026) evaluated a CRACK release of this model and report that its public metadata describes per-layer refusal-vector surgery followed by quantization.</w:t>
+        <w:t xml:space="preserve"> quantized to Q4_K_M. Li et al. (2026) compared Q4_K_M GGUF builds of this same pair, and report that the CRACK release's public metadata describes per-layer refusal-vector surgery followed by quantization. Which upload they used is in their reference list, which we have not checked.</w:t>
       </w:r>
     </w:p>
     <w:p>
@@ -3777,7 +3761,7 @@
           <w:sz w:val="22"/>
           <w:szCs w:val="22"/>
         </w:rPr>
-        <w:t xml:space="preserve">Per-layer weight changes, judged by their structure (concentrated along a few directions) because the release and the base are quantized differently.</w:t>
+        <w:t xml:space="preserve">Per-layer weight changes, judged by their structure (concentrated along a few directions), because the CRACK build may come from a different quantization pipeline than our copy of the base.</w:t>
       </w:r>
     </w:p>
     <w:p>
@@ -4092,7 +4076,7 @@
           <w:sz w:val="22"/>
           <w:szCs w:val="22"/>
         </w:rPr>
-        <w:t xml:space="preserve"> Most checkpoints the user sees are benign repacks. A system that flags them wastes the user's time, so this case measures false positives.</w:t>
+        <w:t xml:space="preserve"> Most checkpoints the user sees are benign repacks, and a system that flags them wastes the user's time. This case has no known answer, so it shows how the system treats a real repack; false-positive rates come from the benchmark's quantization-only variants.</w:t>
       </w:r>
     </w:p>
     <w:p>
@@ -4406,7 +4390,7 @@
           <w:sz w:val="22"/>
           <w:szCs w:val="22"/>
         </w:rPr>
-        <w:t xml:space="preserve"> Modified weights plus exploit-like output look like a backdoor. Chu et al. (2026) strengthen safety by scaling the output weights of harmful detection heads, refusal heads and safety neurons; in one experiment they scale the top 3% of heads by 2.0 and the top 1% of neurons by 1.5, and the final edit's configuration varies by model. Scaling by a factor below 1 would weaken the same components, so the factor matters.</w:t>
+        <w:t xml:space="preserve"> Modified weights plus exploit-like output look like a backdoor. Chu et al. (2026) strengthen safety by scaling the output weights of harmful detection heads, refusal heads and safety neurons; in one experiment they scale the top 3% of heads by 2.0 and the top 1% of neurons by 1.5, and the final edit's configuration varies by model. Scaling by a factor below 1 would weaken the same components, so the factor matters. Because we did not make this edit, it is also the independent test of our localizer.</w:t>
       </w:r>
     </w:p>
     <w:p>
@@ -4439,7 +4423,25 @@
           <w:sz w:val="22"/>
           <w:szCs w:val="22"/>
         </w:rPr>
-        <w:t xml:space="preserve">The edits scale, by factors above 1, exactly the components our localizer finds independently.</w:t>
+        <w:t xml:space="preserve">Every edit multiplies a component's output weights by a factor above 1.</w:t>
+      </w:r>
+    </w:p>
+    <w:p>
+      <w:pPr>
+        <w:pStyle w:val="ListParagraph"/>
+        <w:numPr>
+          <w:ilvl w:val="0"/>
+          <w:numId w:val="3"/>
+        </w:numPr>
+        <w:spacing w:after="40" w:line="252"/>
+      </w:pPr>
+      <w:r>
+        <w:rPr>
+          <w:rFonts w:ascii="Calibri" w:cs="Calibri" w:eastAsia="Calibri" w:hAnsi="Calibri"/>
+          <w:sz w:val="22"/>
+          <w:szCs w:val="22"/>
+        </w:rPr>
+        <w:t xml:space="preserve">The edited components are the ones our localizer finds on its own, without being told which were edited.</w:t>
       </w:r>
     </w:p>
     <w:p>

</xml_diff>